<commit_message>
Language pass: remove em dashes, plain-language rewrite
Swept prompt.md, rubrics.md, the GTF docx footnote, the GTF PDF, and
input_from_user.md for em dashes and stiff phrasing. Rewrote in plainer,
more direct language: shorter sentences, no em dashes or en dashes
anywhere, "Henderson-Hasselbalch" etc. on plain hyphens for consistency,
"It is therefore recommended that..." replaced with "The treatment
system should be operated at pH 3."

No facts, numbers, or rubric coverage changed, only phrasing. Confirmed:
- docx footnote keeps its italic 9pt formatting after the rewrite
- PDF still renders as one clean page
- rubric still 30 criteria, 414 pts, same weight-share bands
- zero em dashes or en dashes left in any of the five files
</commit_message>
<xml_diff>
--- a/task_7/gtf_files/Summary of Adsorption Data at pH 3 and 9.docx
+++ b/task_7/gtf_files/Summary of Adsorption Data at pH 3 and 9.docx
@@ -6464,14 +6464,17 @@
     </w:tbl>
     <w:p>
       <w:r>
-        <w:br w:type="page"/>
+        <w:rPr>
+          <w:i/>
+          <w:sz w:val="18"/>
+        </w:rPr>
+        <w:t>* Timestamp 3 (pH 9) came out to a slightly negative uptake from raw absorbance, inside the instrument's noise floor. It is reported here as 0.00 mol/g and 0% instead of the negative number.</w:t>
       </w:r>
       <w:r>
         <w:rPr>
           <w:i/>
           <w:sz w:val="18"/>
         </w:rPr>
-        <w:t>* Timestamp 3 (pH 9) computed to a slightly negative uptake from raw absorbance, within the instrument's noise floor; reported here as 0.00 mol/g / 0% rather than the negative artifact.</w:t>
       </w:r>
     </w:p>
     <w:p>

</xml_diff>